<commit_message>
Housing and health-care spotlights condensed to one page each
Co-authored-by: CaptainWrechols <CaptainWrechols@users.noreply.github.com>
</commit_message>
<xml_diff>
--- a/briefs/nevada/cost-of-living/citizen-v3/proposal-spotlights.docx
+++ b/briefs/nevada/cost-of-living/citizen-v3/proposal-spotlights.docx
@@ -102,7 +102,7 @@
           <w:color w:val="1A2D4F"/>
           <w:sz w:val="20"/>
         </w:rPr>
-        <w:t>Grant and residency money passes; it recently survived even its own death.</w:t>
+        <w:t>No supply bill has lost a floor vote; the money and the committees decide.</w:t>
       </w:r>
       <w:r>
         <w:rPr>
@@ -111,32 +111,7 @@
           <w:color w:val="444444"/>
           <w:sz w:val="20"/>
         </w:rPr>
-        <w:t xml:space="preserve"> The Statewide Health Care Access and Recruitment Grant Program passed as SB434 (2025), 18–2 and 42–0, died on the session's last day over a final amendment, and was enacted three months later in the special session (SB5, 15–6 and 37–0). Residency grants are in statute (SB350 of 2023, 21–0 and 40–0; revised unanimously in 2025 by SB262), and dental therapy became a licensed profession in 2019.</w:t>
-      </w:r>
-    </w:p>
-    <w:p>
-      <w:pPr>
-        <w:keepLines/>
-        <w:widowControl/>
-        <w:spacing w:before="0" w:after="100" w:lineRule="auto" w:line="276"/>
-      </w:pPr>
-      <w:r>
-        <w:rPr>
-          <w:rFonts w:ascii="Arial" w:hAnsi="Arial" w:cs="Arial" w:eastAsia="Arial"/>
-          <w:b/>
-          <w:color w:val="1A2D4F"/>
-          <w:sz w:val="20"/>
-        </w:rPr>
-        <w:t>The failures were bipartisan too — and they died in committee, not on the floor.</w:t>
-      </w:r>
-      <w:r>
-        <w:rPr>
-          <w:rFonts w:ascii="Arial" w:hAnsi="Arial" w:cs="Arial" w:eastAsia="Arial"/>
-          <w:b w:val="0"/>
-          <w:color w:val="444444"/>
-          <w:sz w:val="20"/>
-        </w:rPr>
-        <w:t xml:space="preserve"> AB372 (2021) and AB393 (2023), physician-recruitment packages of student-debt repayment plus stipends, carried Republican and cross-party sponsors (Assemblymember Heidi Kasama, R, with Senator Roberta Lange, D, on the 2023 bill) and never got out of their first committees. The 2025 workforce-needs assessment (SB495) passed the Senate 13–8 and died in the Assembly. In this lane, the record's obstacle is committee scheduling and money-stage review — no supply bill has lost a floor vote.</w:t>
+        <w:t xml:space="preserve"> The recruitment grant program passed as SB434 (2025), 18–2 and 42–0, died on the final day over an amendment, and was enacted three months later in the special session (SB5, 15–6 and 37–0). Residency grants are law (SB350, 2023, 21–0 and 40–0; revised unanimously in 2025), and dental therapy became a licensed profession in 2019. The failures were bipartisan and quiet: physician-recruitment packages AB372 (2021) and AB393 (2023, Kasama R with Lange D) died in first committees, and the 2025 workforce-needs assessment (SB495) passed the Senate 13–8 and died in the Assembly.</w:t>
       </w:r>
     </w:p>
     <w:p>
@@ -184,7 +159,7 @@
           <w:color w:val="1A2D4F"/>
           <w:sz w:val="20"/>
         </w:rPr>
-        <w:t>Four of five compacts are law, each on unanimous or near-unanimous votes.</w:t>
+        <w:t>Four of five compacts are law on unanimous or near-unanimous votes; nursing's three deaths share an address.</w:t>
       </w:r>
       <w:r>
         <w:rPr>
@@ -193,32 +168,7 @@
           <w:color w:val="444444"/>
           <w:sz w:val="20"/>
         </w:rPr>
-        <w:t xml:space="preserve"> Physical therapy (SB186 of 2019, re-enacted as AB248 of 2025), emergency medical services personnel (AB158, 2023), audiology and speech-language (AB230, 2025), and dental-hygienist licensure by endorsement (AB334, 2025, 42–0 and 21–0). SB124 (2025) added a reciprocity-style path for foreign-trained doctors, 41–0 and 21–0. The physician compact predates this record entirely.</w:t>
-      </w:r>
-    </w:p>
-    <w:p>
-      <w:pPr>
-        <w:keepLines/>
-        <w:widowControl/>
-        <w:spacing w:before="0" w:after="100" w:lineRule="auto" w:line="276"/>
-      </w:pPr>
-      <w:r>
-        <w:rPr>
-          <w:rFonts w:ascii="Arial" w:hAnsi="Arial" w:cs="Arial" w:eastAsia="Arial"/>
-          <w:b/>
-          <w:color w:val="1A2D4F"/>
-          <w:sz w:val="20"/>
-        </w:rPr>
-        <w:t>Nursing is the one gap, and its three deaths share an address.</w:t>
-      </w:r>
-      <w:r>
-        <w:rPr>
-          <w:rFonts w:ascii="Arial" w:hAnsi="Arial" w:cs="Arial" w:eastAsia="Arial"/>
-          <w:b w:val="0"/>
-          <w:color w:val="444444"/>
-          <w:sz w:val="20"/>
-        </w:rPr>
-        <w:t xml:space="preserve"> AB142 (2021) and AB108 (2023) died in Assembly Commerce and Labor; the 2025 five-compact omnibus SB34 died in Senate Commerce and Labor even as two of its compacts passed as standalone bills. The Nurse Licensure Compact has never received a floor vote in Nevada — the Commerce and Labor committees, not the chambers, are where the question has been decided each time.</w:t>
+        <w:t xml:space="preserve"> Enacted: physical therapy (SB186, 2019, re-enacted as AB248, 2025), EMS personnel (AB158, 2023), audiology/speech-language (AB230, 2025), dental-hygienist endorsement (AB334, 2025, 42–0 and 21–0), plus SB124 (2025) easing foreign-trained doctors into licensure, 41–0 and 21–0. The Nurse Licensure Compact has never had a floor vote: AB142 (2021) and AB108 (2023) died in Assembly Commerce and Labor, and the 2025 omnibus SB34 died in Senate Commerce and Labor while two of its compacts passed separately.</w:t>
       </w:r>
     </w:p>
     <w:p>
@@ -266,7 +216,7 @@
           <w:color w:val="1A2D4F"/>
           <w:sz w:val="20"/>
         </w:rPr>
-        <w:t>Provider loan repayment is Nevada's most reliably enacted recruitment tool.</w:t>
+        <w:t>Provider loan repayment keeps passing; patient-side debt relief passes the Legislature and stops at the desk.</w:t>
       </w:r>
       <w:r>
         <w:rPr>
@@ -275,32 +225,7 @@
           <w:color w:val="444444"/>
           <w:sz w:val="20"/>
         </w:rPr>
-        <w:t xml:space="preserve"> Health Service Corps funding passed in 2019 (SB289) and 2021 (SB233); AB45 (2023) created the broader underserved-communities program 41–0 and 21–0; and 2025 widened eligibility twice (AB269, 40–2 and 21–0; SB266, 42–0 and 21–0). Federal loan-forgiveness programs operate alongside all of it.</w:t>
-      </w:r>
-    </w:p>
-    <w:p>
-      <w:pPr>
-        <w:keepLines/>
-        <w:widowControl/>
-        <w:spacing w:before="0" w:after="100" w:lineRule="auto" w:line="276"/>
-      </w:pPr>
-      <w:r>
-        <w:rPr>
-          <w:rFonts w:ascii="Arial" w:hAnsi="Arial" w:cs="Arial" w:eastAsia="Arial"/>
-          <w:b/>
-          <w:color w:val="1A2D4F"/>
-          <w:sz w:val="20"/>
-        </w:rPr>
-        <w:t>Patient-side debt relief is a different story — it passes the Legislature and stops at the desk.</w:t>
-      </w:r>
-      <w:r>
-        <w:rPr>
-          <w:rFonts w:ascii="Arial" w:hAnsi="Arial" w:cs="Arial" w:eastAsia="Arial"/>
-          <w:b w:val="0"/>
-          <w:color w:val="444444"/>
-          <w:sz w:val="20"/>
-        </w:rPr>
-        <w:t xml:space="preserve"> SB248 (2021) set rules for collection agencies pursuing medical debt and became law. Since then the vetoes have concentrated here: AB204 (2025), barring arrests, property liens, and similar collection tactics; AB282 (2025), requiring billers to fix reported overcharges; AB437 (2023), limiting paperwork fees. What survived instead: AB305 (2025) capped medical-leave form charges, and AB343 (2025) made hospitals publish standard charges and price-estimator tools. Debt-relief designs have proven floor majorities; the governor's desk has been the boundary.</w:t>
+        <w:t xml:space="preserve"> Health Service Corps funding passed in 2019 and 2021; AB45 (2023) created the underserved-communities program 41–0 and 21–0; 2025 widened eligibility twice (AB269, SB266). On the debt side, SB248 (2021) — rules for medical-debt collection agencies — is law, but the recent bills were vetoed: AB204 (2025, barring arrests and property liens), AB282 (2025, requiring overcharge corrections), AB437 (2023, paperwork-fee limits). What survived: AB305 (2025) capped leave-form charges and AB343 (2025) made hospitals publish standard charges and price-estimator tools.</w:t>
       </w:r>
     </w:p>
     <w:p>
@@ -348,7 +273,7 @@
           <w:color w:val="1A2D4F"/>
           <w:sz w:val="20"/>
         </w:rPr>
-        <w:t>Nevada has legislated around the edges of pooling — never the any-group design itself.</w:t>
+        <w:t>Nevada has legislated the edges of pooling — never the any-group design, and the ceiling is federal.</w:t>
       </w:r>
       <w:r>
         <w:rPr>
@@ -357,32 +282,7 @@
           <w:color w:val="444444"/>
           <w:sz w:val="20"/>
         </w:rPr>
-        <w:t xml:space="preserve"> SB481 (2019) regulated association health plans and self-funded multiple-employer arrangements offering small-employer coverage, unanimously. SB482 (2019), also enacted, addressed interstate health-care choice compacts that let insurers sell across state lines. SB396 (2021) let public agencies pool with private entities to buy prescription drugs and supplies. The one study of a broadly open public plan (SCR10, 2019) died in its first committee — and then SB420 (2021) built the Public Option anyway, 12–9 and 26–15, the record's rare party-line enactment.</w:t>
-      </w:r>
-    </w:p>
-    <w:p>
-      <w:pPr>
-        <w:keepLines/>
-        <w:widowControl/>
-        <w:spacing w:before="0" w:after="100" w:lineRule="auto" w:line="276"/>
-      </w:pPr>
-      <w:r>
-        <w:rPr>
-          <w:rFonts w:ascii="Arial" w:hAnsi="Arial" w:cs="Arial" w:eastAsia="Arial"/>
-          <w:b/>
-          <w:color w:val="1A2D4F"/>
-          <w:sz w:val="20"/>
-        </w:rPr>
-        <w:t>The ceiling is federal.</w:t>
-      </w:r>
-      <w:r>
-        <w:rPr>
-          <w:rFonts w:ascii="Arial" w:hAnsi="Arial" w:cs="Arial" w:eastAsia="Arial"/>
-          <w:b w:val="0"/>
-          <w:color w:val="444444"/>
-          <w:sz w:val="20"/>
-        </w:rPr>
-        <w:t xml:space="preserve"> Most employer coverage is self-funded and governed by ERISA, beyond any state bill's reach — which is why the tested state designs regulate the pooled products insurers can sell rather than pooling employers directly. The specific any-group design the working group described has never been filed.</w:t>
+        <w:t xml:space="preserve"> SB481 (2019) regulated association health plans and self-funded multiple-employer arrangements, unanimously; SB482 (2019) addressed interstate insurer-choice compacts; SB396 (2021) let public agencies pool with private entities for drug purchasing. The open-to-all study (SCR10, 2019) died in committee — then SB420 (2021) built the Public Option anyway, 12–9 and 26–15. Most employer coverage is self-funded under federal ERISA, beyond state reach, which is why tested designs regulate pooled products rather than pooling employers directly; the any-group design has never been filed.</w:t>
       </w:r>
     </w:p>
     <w:p>

</xml_diff>